<commit_message>
Libro: dedicación de méritos, nombre completo del autor en todo el libro, agradecimientos nuevos; Word de Mauro regenerado
Co-Authored-By: Claude Fable 5.1 <noreply@anthropic.com>
</commit_message>
<xml_diff>
--- a/LIBRO_ELECTROBIOFOTONICA/MANUSCRITO_V2/Instrucciones_maquetacion_Oasis_Electromagnetico_para_Mauro.docx
+++ b/LIBRO_ELECTROBIOFOTONICA/MANUSCRITO_V2/Instrucciones_maquetacion_Oasis_Electromagnetico_para_Mauro.docx
@@ -35,7 +35,7 @@
         <w:t>Autor:</w:t>
       </w:r>
       <w:r>
-        <w:t xml:space="preserve"> Javier Andrés · </w:t>
+        <w:t xml:space="preserve"> Francisco Javier Andrés Andrés, naturópata especialista en Contaminación Electromagnética · </w:t>
       </w:r>
       <w:r>
         <w:rPr>
@@ -731,7 +731,7 @@
         <w:pStyle w:val="ListNumber"/>
       </w:pPr>
       <w:r>
-        <w:t>Página de título (título, subtítulo, autor, "Fundador y director de EKIO Electrosmog", sello EKIO).</w:t>
+        <w:t>Página de título (título, subtítulo, autor con nombre completo "Francisco Javier Andrés Andrés", debajo "Naturópata especialista en Contaminación Electromagnética" y "Fundador y director de EKIO Electrosmog", sello EKIO).</w:t>
       </w:r>
     </w:p>
     <w:p>
@@ -755,7 +755,7 @@
         <w:pStyle w:val="ListNumber"/>
       </w:pPr>
       <w:r>
-        <w:t>Dedicatoria (página sola, derecha).</w:t>
+        <w:t>Dedicación (página sola, derecha, centrada, con aire; es una dedicación de méritos en seis líneas: respetar los cortes de línea).</w:t>
       </w:r>
     </w:p>
     <w:p>
@@ -1655,9 +1655,9 @@
             </w:r>
             <w:r>
               <w:rPr>
-                <w:sz w:val="19"/>
-              </w:rPr>
-              <w:t>`)</w:t>
+                <w:rFonts w:ascii="Menlo" w:hAnsi="Menlo"/>
+                <w:sz w:val="19"/>
+              </w:rPr>
             </w:r>
           </w:p>
         </w:tc>
@@ -5365,7 +5365,7 @@
         <w:t>Portada</w:t>
       </w:r>
       <w:r>
-        <w:t>: título "Oasis Electromagnético" grande; subtítulo debajo; nombre del autor; sello EKIO discreto. La imagen debería sugerir un hogar tranquilo con luz cálida, no un rayo ni un símbolo de peligro. El libro tranquiliza y ordena; no asusta.</w:t>
+        <w:t>: título "Oasis Electromagnético" grande; subtítulo debajo; nombre del autor completo, "Francisco Javier Andrés Andrés"; sello EKIO discreto. La imagen debería sugerir un hogar tranquilo con luz cálida, no un rayo ni un símbolo de peligro. El libro tranquiliza y ordena; no asusta.</w:t>
       </w:r>
     </w:p>
     <w:p>

</xml_diff>